<commit_message>
End-to-end KEGNI functional, and TIGRESS evaluation performed.
</commit_message>
<xml_diff>
--- a/ProjectDescriptions/TCSS 478_588 Winter 2026 group project V2.docx
+++ b/ProjectDescriptions/TCSS 478_588 Winter 2026 group project V2.docx
@@ -62,20 +62,52 @@
     </w:p>
     <w:p>
       <w:r>
-        <w:t xml:space="preserve">Your final project will be graded out of a total of 40 points, and will contribute 40% towards your final grade as stated in the syllabus. </w:t>
+        <w:t xml:space="preserve">Your final project will be graded out of a total of 40 </w:t>
+      </w:r>
+      <w:proofErr w:type="gramStart"/>
+      <w:r>
+        <w:t>points, and</w:t>
+      </w:r>
+      <w:proofErr w:type="gramEnd"/>
+      <w:r>
+        <w:t xml:space="preserve"> will contribute 40% towards your final grade as stated in the syllabus. </w:t>
       </w:r>
     </w:p>
     <w:p/>
     <w:p>
       <w:r>
-        <w:t xml:space="preserve">All work will be submitted via Canvas. Similar to the homework, late submissions </w:t>
-      </w:r>
-      <w:r>
-        <w:rPr>
-          <w:b/>
-          <w:bCs/>
-        </w:rPr>
-        <w:t>within 24-hour of the due date</w:t>
+        <w:t xml:space="preserve">All work will be submitted via Canvas. </w:t>
+      </w:r>
+      <w:proofErr w:type="gramStart"/>
+      <w:r>
+        <w:t>Similar to</w:t>
+      </w:r>
+      <w:proofErr w:type="gramEnd"/>
+      <w:r>
+        <w:t xml:space="preserve"> the homework, late submissions </w:t>
+      </w:r>
+      <w:r>
+        <w:rPr>
+          <w:b/>
+          <w:bCs/>
+        </w:rPr>
+        <w:t xml:space="preserve">within </w:t>
+      </w:r>
+      <w:proofErr w:type="gramStart"/>
+      <w:r>
+        <w:rPr>
+          <w:b/>
+          <w:bCs/>
+        </w:rPr>
+        <w:t>24-hour</w:t>
+      </w:r>
+      <w:proofErr w:type="gramEnd"/>
+      <w:r>
+        <w:rPr>
+          <w:b/>
+          <w:bCs/>
+        </w:rPr>
+        <w:t xml:space="preserve"> of the due date</w:t>
       </w:r>
       <w:r>
         <w:t xml:space="preserve"> will be accepted with a </w:t>
@@ -135,7 +167,15 @@
     </w:p>
     <w:p>
       <w:r>
-        <w:t xml:space="preserve">In class and asynchronous materials, we have discussed high-throughput technologies, such as bulk and single cell RNA sequencing, that can measure gene expression levels of thousands or tens of thousands of genes simultaneously. We also introduced bioinformatics resources and software tools that can be used to analyze biomedical data. </w:t>
+        <w:t xml:space="preserve">In class and asynchronous materials, we have discussed high-throughput technologies, such as bulk and single cell RNA sequencing, that can measure gene expression levels of thousands or </w:t>
+      </w:r>
+      <w:proofErr w:type="gramStart"/>
+      <w:r>
+        <w:t>tens</w:t>
+      </w:r>
+      <w:proofErr w:type="gramEnd"/>
+      <w:r>
+        <w:t xml:space="preserve"> of thousands of genes simultaneously. We also introduced bioinformatics resources and software tools that can be used to analyze biomedical data. </w:t>
       </w:r>
       <w:r>
         <w:rPr>
@@ -235,7 +275,15 @@
         </w:r>
       </w:hyperlink>
       <w:r>
-        <w:t xml:space="preserve">. In particular, DAVs are interested in inferring </w:t>
+        <w:t xml:space="preserve">. </w:t>
+      </w:r>
+      <w:proofErr w:type="gramStart"/>
+      <w:r>
+        <w:t>In particular, DAVs</w:t>
+      </w:r>
+      <w:proofErr w:type="gramEnd"/>
+      <w:r>
+        <w:t xml:space="preserve"> are interested in inferring </w:t>
       </w:r>
       <w:r>
         <w:rPr>
@@ -401,7 +449,15 @@
         <w:t>CRISPR-Cas9</w:t>
       </w:r>
       <w:r>
-        <w:t xml:space="preserve"> is an enzyme that occurs naturally in the bacterial immune system and has the ability to cut DNA. It is localized to an individual target gene by a </w:t>
+        <w:t xml:space="preserve"> is an enzyme that occurs naturally in the bacterial immune system and </w:t>
+      </w:r>
+      <w:proofErr w:type="gramStart"/>
+      <w:r>
+        <w:t>has the ability to</w:t>
+      </w:r>
+      <w:proofErr w:type="gramEnd"/>
+      <w:r>
+        <w:t xml:space="preserve"> cut DNA. It is localized to an individual target gene by a </w:t>
       </w:r>
       <w:r>
         <w:rPr>
@@ -437,7 +493,15 @@
       </w:r>
       <w:proofErr w:type="spellEnd"/>
       <w:r>
-        <w:t xml:space="preserve"> guarantee that the gene was actually perturbed (despite the presence of the targeting gRNA) nor can it guarantee that both copies of the gene (on autosomal chromosomes) are disrupted – that is, the induced mutation may be hetero- rather than homo-</w:t>
+        <w:t xml:space="preserve"> guarantee that the gene was </w:t>
+      </w:r>
+      <w:proofErr w:type="gramStart"/>
+      <w:r>
+        <w:t>actually perturbed</w:t>
+      </w:r>
+      <w:proofErr w:type="gramEnd"/>
+      <w:r>
+        <w:t xml:space="preserve"> (despite the presence of the targeting gRNA) nor can it guarantee that both copies of the gene (on autosomal chromosomes) are disrupted – that is, the induced mutation may be hetero- rather than homo-</w:t>
       </w:r>
       <w:proofErr w:type="spellStart"/>
       <w:r>
@@ -463,6 +527,7 @@
         <w:t xml:space="preserve">expression component of the WT </w:t>
       </w:r>
       <w:proofErr w:type="spellStart"/>
+      <w:proofErr w:type="gramStart"/>
       <w:r>
         <w:rPr>
           <w:b/>
@@ -482,8 +547,17 @@
         </w:rPr>
         <w:t xml:space="preserve"> data</w:t>
       </w:r>
-      <w:r>
-        <w:t xml:space="preserve">. Those data should be used to develop your approach. They are in the </w:t>
+      <w:proofErr w:type="gramEnd"/>
+      <w:r>
+        <w:t xml:space="preserve">. </w:t>
+      </w:r>
+      <w:proofErr w:type="gramStart"/>
+      <w:r>
+        <w:t>Those</w:t>
+      </w:r>
+      <w:proofErr w:type="gramEnd"/>
+      <w:r>
+        <w:t xml:space="preserve"> data should be used to develop your approach. They are in the </w:t>
       </w:r>
       <w:r>
         <w:rPr>
@@ -548,17 +622,26 @@
         <w:t xml:space="preserve">. Each row of the metadata corresponds to a cell, with its cell id the row name. These cell ids are the column names of the data matrix. The cell type is provided in the </w:t>
       </w:r>
       <w:proofErr w:type="spellStart"/>
+      <w:proofErr w:type="gramStart"/>
       <w:r>
         <w:rPr>
           <w:rFonts w:ascii="Courier New" w:eastAsia="Courier New" w:hAnsi="Courier New" w:cs="Courier New"/>
         </w:rPr>
-        <w:t>celltype_jf</w:t>
+        <w:t>celltype</w:t>
+      </w:r>
+      <w:proofErr w:type="gramEnd"/>
+      <w:r>
+        <w:rPr>
+          <w:rFonts w:ascii="Courier New" w:eastAsia="Courier New" w:hAnsi="Courier New" w:cs="Courier New"/>
+        </w:rPr>
+        <w:t>_jf</w:t>
       </w:r>
       <w:proofErr w:type="spellEnd"/>
       <w:r>
         <w:t xml:space="preserve"> column. The data are log-normalized – i.e., we applied </w:t>
       </w:r>
       <w:proofErr w:type="spellStart"/>
+      <w:proofErr w:type="gramStart"/>
       <w:r>
         <w:rPr>
           <w:rFonts w:ascii="Courier New" w:eastAsia="Courier New" w:hAnsi="Courier New" w:cs="Courier New"/>
@@ -580,6 +663,7 @@
         <w:t>normalization.method</w:t>
       </w:r>
       <w:proofErr w:type="spellEnd"/>
+      <w:proofErr w:type="gramEnd"/>
       <w:r>
         <w:rPr>
           <w:rFonts w:ascii="Courier New" w:eastAsia="Courier New" w:hAnsi="Courier New" w:cs="Courier New"/>
@@ -601,6 +685,7 @@
         <w:t xml:space="preserve">”, </w:t>
       </w:r>
       <w:proofErr w:type="spellStart"/>
+      <w:proofErr w:type="gramStart"/>
       <w:r>
         <w:rPr>
           <w:rFonts w:ascii="Courier New" w:eastAsia="Courier New" w:hAnsi="Courier New" w:cs="Courier New"/>
@@ -608,6 +693,7 @@
         <w:t>scale.factor</w:t>
       </w:r>
       <w:proofErr w:type="spellEnd"/>
+      <w:proofErr w:type="gramEnd"/>
       <w:r>
         <w:rPr>
           <w:rFonts w:ascii="Courier New" w:eastAsia="Courier New" w:hAnsi="Courier New" w:cs="Courier New"/>
@@ -638,6 +724,7 @@
         <w:t xml:space="preserve"> from the </w:t>
       </w:r>
       <w:proofErr w:type="spellStart"/>
+      <w:proofErr w:type="gramStart"/>
       <w:r>
         <w:rPr>
           <w:rFonts w:ascii="Courier New" w:eastAsia="Courier New" w:hAnsi="Courier New" w:cs="Courier New"/>
@@ -645,6 +732,7 @@
         <w:t>data.table</w:t>
       </w:r>
       <w:proofErr w:type="spellEnd"/>
+      <w:proofErr w:type="gramEnd"/>
       <w:r>
         <w:t xml:space="preserve"> R package for reading large expression matrices.</w:t>
       </w:r>
@@ -914,6 +1002,7 @@
         <w:t xml:space="preserve">. Each row lists a putative TF target. Amongst other columns, the cell type is in </w:t>
       </w:r>
       <w:proofErr w:type="spellStart"/>
+      <w:proofErr w:type="gramStart"/>
       <w:r>
         <w:rPr>
           <w:rFonts w:ascii="Courier New" w:eastAsia="Courier New" w:hAnsi="Courier New" w:cs="Courier New"/>
@@ -923,6 +1012,7 @@
         <w:t>cell.type</w:t>
       </w:r>
       <w:proofErr w:type="spellEnd"/>
+      <w:proofErr w:type="gramEnd"/>
       <w:r>
         <w:rPr>
           <w:color w:val="1F2328"/>
@@ -1071,7 +1161,15 @@
         </w:r>
       </w:hyperlink>
       <w:r>
-        <w:t xml:space="preserve">. VIPER attempts to quantify the activity of a TF </w:t>
+        <w:t xml:space="preserve">. VIPER attempts to quantify the activity of </w:t>
+      </w:r>
+      <w:proofErr w:type="gramStart"/>
+      <w:r>
+        <w:t>a TF</w:t>
+      </w:r>
+      <w:proofErr w:type="gramEnd"/>
+      <w:r>
+        <w:t xml:space="preserve"> </w:t>
       </w:r>
       <w:r>
         <w:rPr>
@@ -1122,6 +1220,7 @@
         <w:t xml:space="preserve">). That script demonstrates how to apply </w:t>
       </w:r>
       <w:proofErr w:type="spellStart"/>
+      <w:proofErr w:type="gramStart"/>
       <w:r>
         <w:rPr>
           <w:rFonts w:ascii="Courier New" w:eastAsia="Courier New" w:hAnsi="Courier New" w:cs="Courier New"/>
@@ -1129,6 +1228,7 @@
         <w:t>score.viper</w:t>
       </w:r>
       <w:proofErr w:type="spellEnd"/>
+      <w:proofErr w:type="gramEnd"/>
       <w:r>
         <w:t xml:space="preserve"> to GRNBoost2 results derived from the CHOOSE dataset. It generates a plot (</w:t>
       </w:r>
@@ -1221,13 +1321,18 @@
       </w:r>
       <w:proofErr w:type="spellEnd"/>
       <w:r>
-        <w:t xml:space="preserve"> We set the likelihood to one for simplicity. It also attempts to account for shared targets across TFs via a </w:t>
+        <w:t xml:space="preserve"> We set the likelihood to one for simplicity. It also attempts to account for shared targets across TFs via </w:t>
+      </w:r>
+      <w:proofErr w:type="gramStart"/>
+      <w:r>
+        <w:t xml:space="preserve">a </w:t>
       </w:r>
       <w:proofErr w:type="spellStart"/>
       <w:r>
         <w:t>pleotropy</w:t>
       </w:r>
       <w:proofErr w:type="spellEnd"/>
+      <w:proofErr w:type="gramEnd"/>
       <w:r>
         <w:t xml:space="preserve"> correction. This is useful when attempting to rank the relative activity of TFs. However, that is not relevant to our goal. As such, we do not apply that correction.</w:t>
       </w:r>
@@ -1311,7 +1416,15 @@
         </w:r>
       </w:hyperlink>
       <w:r>
-        <w:t xml:space="preserve">). Note that VIPER has been applied to different molecular readouts – including log fold changes from differential expression analyses. We apply it to normalized expression values. Given this application and at an abstract level, within each cell (or sample) VIPER ranks genes based on their expression value – with lowly expressed genes having the lowest rank (i.e., near one). For a putative set of TF targets, it then looks for an enrichment of targets at either or both of the extreme ends of the rank — this is the so-called 2-tail test. A TF target will score well in the 2-tail test if it is repressed (low/negative GRN prediction score) and has low rank </w:t>
+        <w:t xml:space="preserve">). Note that VIPER has been applied to different molecular readouts – including log fold changes from differential expression analyses. We apply it to normalized expression values. Given this application and at an abstract level, within each cell (or sample) VIPER ranks genes based on their expression value – with lowly expressed genes having the lowest rank (i.e., near one). For a putative set of TF targets, it then looks for an enrichment of targets at either or </w:t>
+      </w:r>
+      <w:proofErr w:type="gramStart"/>
+      <w:r>
+        <w:t>both of the extreme</w:t>
+      </w:r>
+      <w:proofErr w:type="gramEnd"/>
+      <w:r>
+        <w:t xml:space="preserve"> ends of the rank — this is the so-called 2-tail test. A TF target will score well in the 2-tail test if it is repressed (low/negative GRN prediction score) and has low rank </w:t>
       </w:r>
       <w:r>
         <w:rPr>
@@ -1321,7 +1434,15 @@
         <w:t xml:space="preserve">or </w:t>
       </w:r>
       <w:r>
-        <w:t>if it is induced (high/positive GRN prediction score) and has high rank. VIPER performs a second “1-tail” test – here the cell’s genes are re-ranked such that those with extreme (low or high) expression values have highest rank and those with moderate expression have low rank. VIPER finally performs a “3-tail” test which combines the 1- and 2-tail tests. For each gene, the 1- and 2-tail gene scores are weighted according to the gene target’s mode of regulation (</w:t>
+        <w:t>if it is induced (high/positive GRN prediction score) and has high rank. VIPER performs a second “1-tail” test – here the cell’s genes are re-</w:t>
+      </w:r>
+      <w:proofErr w:type="gramStart"/>
+      <w:r>
+        <w:t>ranked</w:t>
+      </w:r>
+      <w:proofErr w:type="gramEnd"/>
+      <w:r>
+        <w:t xml:space="preserve"> such that those with extreme (low or high) expression values have highest rank and those with moderate expression have low rank. VIPER finally performs a “3-tail” test which combines the 1- and 2-tail tests. For each gene, the 1- and 2-tail gene scores are weighted according to the gene target’s mode of regulation (</w:t>
       </w:r>
       <w:proofErr w:type="spellStart"/>
       <w:r>
@@ -1346,7 +1467,15 @@
         <w:t>ES</w:t>
       </w:r>
       <w:r>
-        <w:t xml:space="preserve">) that quantifies the activity of the TF; its sign is that of the sum of the 1-tailed scores. For both the 1- and 2-tail tests, ranks are converted to scores by quantile normalizing them (to the normal distribution), such that low ranks (near 1) have low scores (near the left tail of the normal distribution cumulative density function) and high ranks have high scores (near the right tail of the cumulative density function). </w:t>
+        <w:t xml:space="preserve">) that quantifies the activity of the TF; its sign is that of the sum of the 1-tailed scores. For both the 1- and 2-tail tests, ranks are converted to scores by quantile normalizing them (to the normal distribution), such that low ranks (near 1) have low scores (near the left tail of the </w:t>
+      </w:r>
+      <w:proofErr w:type="gramStart"/>
+      <w:r>
+        <w:t>normal distribution</w:t>
+      </w:r>
+      <w:proofErr w:type="gramEnd"/>
+      <w:r>
+        <w:t xml:space="preserve"> cumulative density function) and high ranks have high scores (near the right tail of the cumulative density function). </w:t>
       </w:r>
     </w:p>
     <w:p/>
@@ -1503,6 +1632,7 @@
         </w:rPr>
         <w:t>q</w:t>
       </w:r>
+      <w:proofErr w:type="gramStart"/>
       <w:r>
         <w:rPr>
           <w:i/>
@@ -1511,6 +1641,7 @@
         </w:rPr>
         <w:t>2,i</w:t>
       </w:r>
+      <w:proofErr w:type="gramEnd"/>
       <w:r>
         <w:t xml:space="preserve"> be the normalized rank of gene </w:t>
       </w:r>
@@ -1531,6 +1662,7 @@
         </w:rPr>
         <w:t>q</w:t>
       </w:r>
+      <w:proofErr w:type="gramStart"/>
       <w:r>
         <w:rPr>
           <w:i/>
@@ -1539,6 +1671,7 @@
         </w:rPr>
         <w:t>2,i</w:t>
       </w:r>
+      <w:proofErr w:type="gramEnd"/>
       <w:r>
         <w:t xml:space="preserve"> corresponds to the lowest expressed gene).</w:t>
       </w:r>
@@ -1654,8 +1787,13 @@
       </w:pPr>
     </w:p>
     <w:p>
-      <w:r>
-        <w:t>weighted by the (signed) Mode of Regulation (</w:t>
+      <w:proofErr w:type="gramStart"/>
+      <w:r>
+        <w:t>weighted</w:t>
+      </w:r>
+      <w:proofErr w:type="gramEnd"/>
+      <w:r>
+        <w:t xml:space="preserve"> by the (signed) Mode of Regulation (</w:t>
       </w:r>
       <w:proofErr w:type="spellStart"/>
       <w:r>
@@ -1758,8 +1896,13 @@
     </w:p>
     <w:p/>
     <w:p>
-      <w:r>
-        <w:t xml:space="preserve">Recall that the </w:t>
+      <w:proofErr w:type="gramStart"/>
+      <w:r>
+        <w:t>Recall</w:t>
+      </w:r>
+      <w:proofErr w:type="gramEnd"/>
+      <w:r>
+        <w:t xml:space="preserve"> that the </w:t>
       </w:r>
       <w:proofErr w:type="spellStart"/>
       <w:r>
@@ -2107,6 +2250,7 @@
         </w:rPr>
         <w:t>q</w:t>
       </w:r>
+      <w:proofErr w:type="gramStart"/>
       <w:r>
         <w:rPr>
           <w:i/>
@@ -2115,6 +2259,7 @@
         </w:rPr>
         <w:t>1,i</w:t>
       </w:r>
+      <w:proofErr w:type="gramEnd"/>
       <w:r>
         <w:t xml:space="preserve"> of gene </w:t>
       </w:r>
@@ -2135,6 +2280,7 @@
         </w:rPr>
         <w:t>q</w:t>
       </w:r>
+      <w:proofErr w:type="gramStart"/>
       <w:r>
         <w:rPr>
           <w:i/>
@@ -2143,6 +2289,7 @@
         </w:rPr>
         <w:t>2,i</w:t>
       </w:r>
+      <w:proofErr w:type="gramEnd"/>
       <w:r>
         <w:t xml:space="preserve"> such that values near </w:t>
       </w:r>
@@ -2153,6 +2300,7 @@
         </w:rPr>
         <w:t>q</w:t>
       </w:r>
+      <w:proofErr w:type="gramStart"/>
       <w:r>
         <w:rPr>
           <w:i/>
@@ -2161,6 +2309,7 @@
         </w:rPr>
         <w:t>2,i</w:t>
       </w:r>
+      <w:proofErr w:type="gramEnd"/>
       <w:r>
         <w:t xml:space="preserve"> = 0 or </w:t>
       </w:r>
@@ -2171,6 +2320,7 @@
         </w:rPr>
         <w:t>q</w:t>
       </w:r>
+      <w:proofErr w:type="gramStart"/>
       <w:r>
         <w:rPr>
           <w:i/>
@@ -2179,6 +2329,7 @@
         </w:rPr>
         <w:t>2,i</w:t>
       </w:r>
+      <w:proofErr w:type="gramEnd"/>
       <w:r>
         <w:t xml:space="preserve"> = 1 have high </w:t>
       </w:r>
@@ -2189,6 +2340,7 @@
         </w:rPr>
         <w:t>q</w:t>
       </w:r>
+      <w:proofErr w:type="gramStart"/>
       <w:r>
         <w:rPr>
           <w:i/>
@@ -2197,6 +2349,7 @@
         </w:rPr>
         <w:t>1,i</w:t>
       </w:r>
+      <w:proofErr w:type="gramEnd"/>
       <w:r>
         <w:t xml:space="preserve"> near 1, whereas intermediate values near </w:t>
       </w:r>
@@ -2207,6 +2360,7 @@
         </w:rPr>
         <w:t>q</w:t>
       </w:r>
+      <w:proofErr w:type="gramStart"/>
       <w:r>
         <w:rPr>
           <w:i/>
@@ -2215,6 +2369,7 @@
         </w:rPr>
         <w:t>2,i</w:t>
       </w:r>
+      <w:proofErr w:type="gramEnd"/>
       <w:r>
         <w:t xml:space="preserve"> = 0.5 have low </w:t>
       </w:r>
@@ -2225,6 +2380,7 @@
         </w:rPr>
         <w:t>q</w:t>
       </w:r>
+      <w:proofErr w:type="gramStart"/>
       <w:r>
         <w:rPr>
           <w:i/>
@@ -2233,6 +2389,7 @@
         </w:rPr>
         <w:t>1,i</w:t>
       </w:r>
+      <w:proofErr w:type="gramEnd"/>
       <w:r>
         <w:t xml:space="preserve"> near 0:</w:t>
       </w:r>
@@ -2291,9 +2448,11 @@
       </w:pPr>
     </w:p>
     <w:p>
+      <w:proofErr w:type="gramStart"/>
       <w:r>
         <w:t>where</w:t>
       </w:r>
+      <w:proofErr w:type="gramEnd"/>
     </w:p>
     <w:p/>
     <w:p>
@@ -2349,8 +2508,21 @@
       </w:pPr>
     </w:p>
     <w:p>
-      <w:r>
-        <w:t xml:space="preserve">is a constant contributing a small, gene-independent shift. These </w:t>
+      <w:proofErr w:type="gramStart"/>
+      <w:r>
+        <w:t>is a constant</w:t>
+      </w:r>
+      <w:proofErr w:type="gramEnd"/>
+      <w:r>
+        <w:t xml:space="preserve"> </w:t>
+      </w:r>
+      <w:proofErr w:type="gramStart"/>
+      <w:r>
+        <w:t>contributing</w:t>
+      </w:r>
+      <w:proofErr w:type="gramEnd"/>
+      <w:r>
+        <w:t xml:space="preserve"> a small, gene-independent shift. These </w:t>
       </w:r>
       <w:r>
         <w:rPr>
@@ -2359,6 +2531,7 @@
         </w:rPr>
         <w:t>q</w:t>
       </w:r>
+      <w:proofErr w:type="gramStart"/>
       <w:r>
         <w:rPr>
           <w:i/>
@@ -2367,6 +2540,7 @@
         </w:rPr>
         <w:t>1,i</w:t>
       </w:r>
+      <w:proofErr w:type="gramEnd"/>
       <w:r>
         <w:t xml:space="preserve"> are then weighted by the positive 1 - | </w:t>
       </w:r>
@@ -2482,7 +2656,15 @@
     <w:p/>
     <w:p>
       <w:r>
-        <w:t xml:space="preserve">So, genes with extreme expression and strong predicted repression or induction will contribute to </w:t>
+        <w:t xml:space="preserve">So, genes with extreme </w:t>
+      </w:r>
+      <w:proofErr w:type="gramStart"/>
+      <w:r>
+        <w:t>expression</w:t>
+      </w:r>
+      <w:proofErr w:type="gramEnd"/>
+      <w:r>
+        <w:t xml:space="preserve"> and strong predicted repression or induction will contribute to </w:t>
       </w:r>
       <w:r>
         <w:rPr>
@@ -2686,8 +2868,13 @@
     </w:p>
     <w:p/>
     <w:p>
-      <w:r>
-        <w:t>In particular, note that it does not hardco</w:t>
+      <w:proofErr w:type="gramStart"/>
+      <w:r>
+        <w:t>In particular, note</w:t>
+      </w:r>
+      <w:proofErr w:type="gramEnd"/>
+      <w:r>
+        <w:t xml:space="preserve"> that it does not hardco</w:t>
       </w:r>
       <w:r>
         <w:t>d</w:t>
@@ -2724,28 +2911,38 @@
         <w:t xml:space="preserve">Your function should return a </w:t>
       </w:r>
       <w:proofErr w:type="spellStart"/>
+      <w:proofErr w:type="gramStart"/>
       <w:r>
         <w:t>data.frame</w:t>
       </w:r>
       <w:proofErr w:type="spellEnd"/>
+      <w:proofErr w:type="gramEnd"/>
       <w:r>
         <w:t xml:space="preserve"> with the same columns as </w:t>
       </w:r>
       <w:proofErr w:type="spellStart"/>
+      <w:proofErr w:type="gramStart"/>
       <w:r>
         <w:t>score.viper</w:t>
       </w:r>
       <w:proofErr w:type="spellEnd"/>
+      <w:proofErr w:type="gramEnd"/>
       <w:r>
         <w:t xml:space="preserve">. </w:t>
       </w:r>
     </w:p>
     <w:p/>
     <w:p>
-      <w:r>
-        <w:t>In particular, each row corresponds to a cell. Columns indicate the cell’s type (</w:t>
-      </w:r>
-      <w:proofErr w:type="spellStart"/>
+      <w:proofErr w:type="gramStart"/>
+      <w:r>
+        <w:t>In particular, each</w:t>
+      </w:r>
+      <w:proofErr w:type="gramEnd"/>
+      <w:r>
+        <w:t xml:space="preserve"> row corresponds to a cell. Columns indicate the cell’s type (</w:t>
+      </w:r>
+      <w:proofErr w:type="spellStart"/>
+      <w:proofErr w:type="gramStart"/>
       <w:r>
         <w:rPr>
           <w:rFonts w:ascii="Courier New" w:eastAsia="Courier New" w:hAnsi="Courier New" w:cs="Courier New"/>
@@ -2753,6 +2950,7 @@
         <w:t>cell.type</w:t>
       </w:r>
       <w:proofErr w:type="spellEnd"/>
+      <w:proofErr w:type="gramEnd"/>
       <w:r>
         <w:t xml:space="preserve">), the </w:t>
       </w:r>
@@ -2803,7 +3001,23 @@
       </w:r>
       <w:r>
         <w:lastRenderedPageBreak/>
-        <w:t xml:space="preserve">type/TF pair. Within that pair, lower scores indicate less activity of the TF than higher scores. In that sense, the relative value of scores is important – their sign or absolute value is not relevant. You should report the activity of each TF for all WT cells and of each particular TF that is perturbed in a given cell. </w:t>
+        <w:t xml:space="preserve">type/TF pair. Within that pair, lower scores indicate less activity of the TF than higher scores. In that sense, the relative value of scores is important – their sign or absolute value is not relevant. You should report the activity of each TF for all WT cells and of each </w:t>
+      </w:r>
+      <w:proofErr w:type="gramStart"/>
+      <w:r>
+        <w:t>particular TF</w:t>
+      </w:r>
+      <w:proofErr w:type="gramEnd"/>
+      <w:r>
+        <w:t xml:space="preserve"> that is perturbed </w:t>
+      </w:r>
+      <w:proofErr w:type="gramStart"/>
+      <w:r>
+        <w:t>in a given</w:t>
+      </w:r>
+      <w:proofErr w:type="gramEnd"/>
+      <w:r>
+        <w:t xml:space="preserve"> cell. </w:t>
       </w:r>
     </w:p>
     <w:p/>
@@ -2862,7 +3076,15 @@
         <w:ind w:left="720"/>
       </w:pPr>
       <w:r>
-        <w:t>Post your recorded presentation on Canvas Discussion Board. Your recorded presentation must be under 20 minutes, and include the division of labor.</w:t>
+        <w:t xml:space="preserve">Post your recorded presentation on Canvas Discussion Board. Your recorded presentation must be under 20 </w:t>
+      </w:r>
+      <w:proofErr w:type="gramStart"/>
+      <w:r>
+        <w:t>minutes, and</w:t>
+      </w:r>
+      <w:proofErr w:type="gramEnd"/>
+      <w:r>
+        <w:t xml:space="preserve"> include the division of labor.</w:t>
       </w:r>
     </w:p>
     <w:p/>
@@ -2880,7 +3102,15 @@
     <w:p/>
     <w:p>
       <w:r>
-        <w:t xml:space="preserve">You can use existing bioinformatics resources (including GitHub) and software tools as long as you </w:t>
+        <w:t xml:space="preserve">You can use existing bioinformatics resources (including GitHub) and software tools </w:t>
+      </w:r>
+      <w:proofErr w:type="gramStart"/>
+      <w:r>
+        <w:t>as long as</w:t>
+      </w:r>
+      <w:proofErr w:type="gramEnd"/>
+      <w:r>
+        <w:t xml:space="preserve"> you </w:t>
       </w:r>
       <w:r>
         <w:rPr>
@@ -2916,7 +3146,15 @@
         <w:t xml:space="preserve"> You can use either R or Python in this project.</w:t>
       </w:r>
       <w:r>
-        <w:t xml:space="preserve"> The use of generative AI is allowed as long as you cite the resource.</w:t>
+        <w:t xml:space="preserve"> The use of generative AI is allowed </w:t>
+      </w:r>
+      <w:proofErr w:type="gramStart"/>
+      <w:r>
+        <w:t>as long as</w:t>
+      </w:r>
+      <w:proofErr w:type="gramEnd"/>
+      <w:r>
+        <w:t xml:space="preserve"> you cite the resource.</w:t>
       </w:r>
     </w:p>
     <w:p>
@@ -2934,7 +3172,15 @@
         <w:t xml:space="preserve">Learning objectives: </w:t>
       </w:r>
       <w:r>
-        <w:t>You will acquire experience reading journal papers, hands-on experience analyzing published genomic data. You will also gain experience in giving scientific presentations, writing scientific reports and working as a team.</w:t>
+        <w:t xml:space="preserve">You will acquire experience reading journal papers, hands-on experience analyzing published genomic data. You will also gain experience </w:t>
+      </w:r>
+      <w:proofErr w:type="gramStart"/>
+      <w:r>
+        <w:t>in</w:t>
+      </w:r>
+      <w:proofErr w:type="gramEnd"/>
+      <w:r>
+        <w:t xml:space="preserve"> giving scientific presentations, writing scientific reports and working as a team.</w:t>
       </w:r>
     </w:p>
     <w:p/>
@@ -2967,7 +3213,23 @@
       </w:r>
       <w:proofErr w:type="spellEnd"/>
       <w:r>
-        <w:t xml:space="preserve"> consortium, you can check  out the following marker paper:</w:t>
+        <w:t xml:space="preserve"> consortium, you can </w:t>
+      </w:r>
+      <w:proofErr w:type="gramStart"/>
+      <w:r>
+        <w:t>check  out</w:t>
+      </w:r>
+      <w:proofErr w:type="gramEnd"/>
+      <w:r>
+        <w:t xml:space="preserve"> the </w:t>
+      </w:r>
+      <w:proofErr w:type="gramStart"/>
+      <w:r>
+        <w:t>following marker</w:t>
+      </w:r>
+      <w:proofErr w:type="gramEnd"/>
+      <w:r>
+        <w:t xml:space="preserve"> paper:</w:t>
       </w:r>
     </w:p>
     <w:p>
@@ -3160,13 +3422,23 @@
         </w:rPr>
         <w:t xml:space="preserve">The report is expected to include the following sections: </w:t>
       </w:r>
-      <w:r>
-        <w:rPr>
-          <w:b/>
-          <w:bCs/>
-          <w:color w:val="2D3B45"/>
-        </w:rPr>
-        <w:t>Title,  Abstract, Introduction, Methods, Results and Discussion</w:t>
+      <w:proofErr w:type="gramStart"/>
+      <w:r>
+        <w:rPr>
+          <w:b/>
+          <w:bCs/>
+          <w:color w:val="2D3B45"/>
+        </w:rPr>
+        <w:t>Title,  Abstract</w:t>
+      </w:r>
+      <w:proofErr w:type="gramEnd"/>
+      <w:r>
+        <w:rPr>
+          <w:b/>
+          <w:bCs/>
+          <w:color w:val="2D3B45"/>
+        </w:rPr>
+        <w:t>, Introduction, Methods, Results and Discussion</w:t>
       </w:r>
       <w:r>
         <w:rPr>
@@ -3286,7 +3558,21 @@
         <w:rPr>
           <w:color w:val="2D3B45"/>
         </w:rPr>
-        <w:t>You can choose to write your report using any word processing tools, such as Word, Google Doc, Latex, Overleaf etc.</w:t>
+        <w:t xml:space="preserve">You can choose to write your report using any word processing tools, such as Word, Google Doc, Latex, </w:t>
+      </w:r>
+      <w:proofErr w:type="gramStart"/>
+      <w:r>
+        <w:rPr>
+          <w:color w:val="2D3B45"/>
+        </w:rPr>
+        <w:t>Overleaf</w:t>
+      </w:r>
+      <w:proofErr w:type="gramEnd"/>
+      <w:r>
+        <w:rPr>
+          <w:color w:val="2D3B45"/>
+        </w:rPr>
+        <w:t xml:space="preserve"> etc.</w:t>
       </w:r>
     </w:p>
     <w:p>
@@ -3308,7 +3594,21 @@
         <w:rPr>
           <w:color w:val="2D3B45"/>
         </w:rPr>
-        <w:t>You are NOT required to use the following suggested templates, as long as your report contains all the required sections.</w:t>
+        <w:t xml:space="preserve">You are NOT required to use the following suggested templates, </w:t>
+      </w:r>
+      <w:proofErr w:type="gramStart"/>
+      <w:r>
+        <w:rPr>
+          <w:color w:val="2D3B45"/>
+        </w:rPr>
+        <w:t>as long as</w:t>
+      </w:r>
+      <w:proofErr w:type="gramEnd"/>
+      <w:r>
+        <w:rPr>
+          <w:color w:val="2D3B45"/>
+        </w:rPr>
+        <w:t xml:space="preserve"> your report contains all the required sections.</w:t>
       </w:r>
     </w:p>
     <w:p>
@@ -3447,7 +3747,21 @@
         <w:rPr>
           <w:color w:val="2D3B45"/>
         </w:rPr>
-        <w:t>(2 points) Clear description of results. Proper use of graphs, charts, tables in the description of results. Figures/tables have captions, and are clearly labeled.</w:t>
+        <w:t xml:space="preserve">(2 points) Clear description of results. Proper use of graphs, charts, tables in the description of results. Figures/tables have </w:t>
+      </w:r>
+      <w:proofErr w:type="gramStart"/>
+      <w:r>
+        <w:rPr>
+          <w:color w:val="2D3B45"/>
+        </w:rPr>
+        <w:t>captions, and</w:t>
+      </w:r>
+      <w:proofErr w:type="gramEnd"/>
+      <w:r>
+        <w:rPr>
+          <w:color w:val="2D3B45"/>
+        </w:rPr>
+        <w:t xml:space="preserve"> are clearly labeled.</w:t>
       </w:r>
     </w:p>
     <w:p>
@@ -3495,7 +3809,21 @@
         <w:rPr>
           <w:color w:val="2D3B45"/>
         </w:rPr>
-        <w:t>(2 points) Format: Report includes the required sections (Title,  Abstract, Introduction, Methods, Results and Discussion). Include citations and references.</w:t>
+        <w:t>(2 points) Format: Report includes the required sections (</w:t>
+      </w:r>
+      <w:proofErr w:type="gramStart"/>
+      <w:r>
+        <w:rPr>
+          <w:color w:val="2D3B45"/>
+        </w:rPr>
+        <w:t>Title,  Abstract</w:t>
+      </w:r>
+      <w:proofErr w:type="gramEnd"/>
+      <w:r>
+        <w:rPr>
+          <w:color w:val="2D3B45"/>
+        </w:rPr>
+        <w:t>, Introduction, Methods, Results and Discussion). Include citations and references.</w:t>
       </w:r>
     </w:p>
     <w:p>
@@ -3590,7 +3918,21 @@
           <w:color w:val="2D3B45"/>
         </w:rPr>
         <w:lastRenderedPageBreak/>
-        <w:t>(2 points) Clear description of results, and thoughtful discussion to support the observations. Proper use of graphs, charts, tables in the description of results. Figures/tables have captions, and are clearly labeled.</w:t>
+        <w:t xml:space="preserve">(2 points) Clear description of results, and thoughtful discussion to support the observations. Proper use of graphs, charts, tables in the description of results. Figures/tables have </w:t>
+      </w:r>
+      <w:proofErr w:type="gramStart"/>
+      <w:r>
+        <w:rPr>
+          <w:color w:val="2D3B45"/>
+        </w:rPr>
+        <w:t>captions, and</w:t>
+      </w:r>
+      <w:proofErr w:type="gramEnd"/>
+      <w:r>
+        <w:rPr>
+          <w:color w:val="2D3B45"/>
+        </w:rPr>
+        <w:t xml:space="preserve"> are clearly labeled.</w:t>
       </w:r>
     </w:p>
     <w:p>
@@ -3622,7 +3964,21 @@
         <w:rPr>
           <w:color w:val="2D3B45"/>
         </w:rPr>
-        <w:t>(2 points) Format: Report includes the required sections (Title,  Abstract, Introduction, Methods, Results and Discussion). The bibliography follows a recognized scholarly style. Citations are thorough and well documented throughout the paper.</w:t>
+        <w:t>(2 points) Format: Report includes the required sections (</w:t>
+      </w:r>
+      <w:proofErr w:type="gramStart"/>
+      <w:r>
+        <w:rPr>
+          <w:color w:val="2D3B45"/>
+        </w:rPr>
+        <w:t>Title,  Abstract</w:t>
+      </w:r>
+      <w:proofErr w:type="gramEnd"/>
+      <w:r>
+        <w:rPr>
+          <w:color w:val="2D3B45"/>
+        </w:rPr>
+        <w:t>, Introduction, Methods, Results and Discussion). The bibliography follows a recognized scholarly style. Citations are thorough and well documented throughout the paper.</w:t>
       </w:r>
     </w:p>
     <w:p>

</xml_diff>